<commit_message>
add emergency and additionalinfo in header
</commit_message>
<xml_diff>
--- a/templates/barangayID.docx
+++ b/templates/barangayID.docx
@@ -145,7 +145,7 @@
                         <w:txbxContent>
                           <w:p>
                             <w:pPr>
-                              <w:pStyle w:val="FrameContentsuser"/>
+                              <w:pStyle w:val="FrameContents"/>
                               <w:spacing w:before="0" w:after="160"/>
                               <w:ind w:firstLineChars="50"/>
                               <w:rPr>
@@ -190,7 +190,7 @@
                   <w:txbxContent>
                     <w:p>
                       <w:pPr>
-                        <w:pStyle w:val="FrameContentsuser"/>
+                        <w:pStyle w:val="FrameContents"/>
                         <w:spacing w:before="0" w:after="160"/>
                         <w:ind w:firstLineChars="50"/>
                         <w:rPr>
@@ -266,7 +266,7 @@
                         <w:txbxContent>
                           <w:p>
                             <w:pPr>
-                              <w:pStyle w:val="FrameContentsuser"/>
+                              <w:pStyle w:val="FrameContents"/>
                               <w:spacing w:before="0" w:after="160"/>
                               <w:ind w:firstLineChars="50"/>
                               <w:rPr>
@@ -311,7 +311,7 @@
                   <w:txbxContent>
                     <w:p>
                       <w:pPr>
-                        <w:pStyle w:val="FrameContentsuser"/>
+                        <w:pStyle w:val="FrameContents"/>
                         <w:spacing w:before="0" w:after="160"/>
                         <w:ind w:firstLineChars="50"/>
                         <w:rPr>
@@ -346,7 +346,7 @@
         <mc:AlternateContent>
           <mc:Choice Requires="wps">
             <w:drawing>
-              <wp:anchor distT="0" distB="0" distL="0" distR="0" simplePos="0" relativeHeight="16" behindDoc="0" locked="0" layoutInCell="1" allowOverlap="1">
+              <wp:anchor distT="0" distB="0" distL="0" distR="0" simplePos="0" relativeHeight="20" behindDoc="0" locked="0" layoutInCell="1" allowOverlap="1">
                 <wp:simplePos x="0" y="0"/>
                 <wp:positionH relativeFrom="column">
                   <wp:posOffset>5640705</wp:posOffset>
@@ -387,7 +387,7 @@
                         <w:txbxContent>
                           <w:p>
                             <w:pPr>
-                              <w:pStyle w:val="FrameContentsuser"/>
+                              <w:pStyle w:val="FrameContents"/>
                               <w:spacing w:before="0" w:after="160"/>
                               <w:ind w:firstLineChars="50"/>
                               <w:rPr>
@@ -432,7 +432,7 @@
                   <w:txbxContent>
                     <w:p>
                       <w:pPr>
-                        <w:pStyle w:val="FrameContentsuser"/>
+                        <w:pStyle w:val="FrameContents"/>
                         <w:spacing w:before="0" w:after="160"/>
                         <w:ind w:firstLineChars="50"/>
                         <w:rPr>
@@ -521,7 +521,7 @@
                         <w:txbxContent>
                           <w:p>
                             <w:pPr>
-                              <w:pStyle w:val="FrameContentsuser"/>
+                              <w:pStyle w:val="FrameContents"/>
                               <w:spacing w:before="0" w:after="160"/>
                               <w:ind w:firstLineChars="50"/>
                               <w:rPr>
@@ -566,7 +566,7 @@
                   <w:txbxContent>
                     <w:p>
                       <w:pPr>
-                        <w:pStyle w:val="FrameContentsuser"/>
+                        <w:pStyle w:val="FrameContents"/>
                         <w:spacing w:before="0" w:after="160"/>
                         <w:ind w:firstLineChars="50"/>
                         <w:rPr>
@@ -651,7 +651,7 @@
                         <w:txbxContent>
                           <w:p>
                             <w:pPr>
-                              <w:pStyle w:val="FrameContentsuser"/>
+                              <w:pStyle w:val="FrameContents"/>
                               <w:rPr>
                                 <w:rFonts w:ascii="Impact" w:hAnsi="Impact" w:cs="Impact"/>
                                 <w:b w:val="false"/>
@@ -676,7 +676,7 @@
                           </w:p>
                           <w:p>
                             <w:pPr>
-                              <w:pStyle w:val="FrameContentsuser"/>
+                              <w:pStyle w:val="FrameContents"/>
                               <w:spacing w:before="0" w:after="160"/>
                               <w:rPr>
                                 <w:rFonts w:ascii="Impact" w:hAnsi="Impact" w:cs="Impact"/>
@@ -713,7 +713,7 @@
                   <w:txbxContent>
                     <w:p>
                       <w:pPr>
-                        <w:pStyle w:val="FrameContentsuser"/>
+                        <w:pStyle w:val="FrameContents"/>
                         <w:rPr>
                           <w:rFonts w:ascii="Impact" w:hAnsi="Impact" w:cs="Impact"/>
                           <w:b w:val="false"/>
@@ -738,7 +738,7 @@
                     </w:p>
                     <w:p>
                       <w:pPr>
-                        <w:pStyle w:val="FrameContentsuser"/>
+                        <w:pStyle w:val="FrameContents"/>
                         <w:spacing w:before="0" w:after="160"/>
                         <w:rPr>
                           <w:rFonts w:ascii="Impact" w:hAnsi="Impact" w:cs="Impact"/>
@@ -804,7 +804,7 @@
                         <w:txbxContent>
                           <w:p>
                             <w:pPr>
-                              <w:pStyle w:val="FrameContentsuser"/>
+                              <w:pStyle w:val="FrameContents"/>
                               <w:spacing w:before="0" w:after="160"/>
                               <w:rPr>
                                 <w:rFonts w:ascii="Impact" w:hAnsi="Impact" w:cs="Impact"/>
@@ -841,7 +841,7 @@
                   <w:txbxContent>
                     <w:p>
                       <w:pPr>
-                        <w:pStyle w:val="FrameContentsuser"/>
+                        <w:pStyle w:val="FrameContents"/>
                         <w:spacing w:before="0" w:after="160"/>
                         <w:rPr>
                           <w:rFonts w:ascii="Impact" w:hAnsi="Impact" w:cs="Impact"/>
@@ -907,8 +907,8 @@
                         <w:txbxContent>
                           <w:p>
                             <w:pPr>
-                              <w:pStyle w:val="FrameContents"/>
-                              <w:overflowPunct w:val="true"/>
+                              <w:pStyle w:val="FrameContentsuser"/>
+                              <w:overflowPunct w:val="false"/>
                               <w:spacing w:lineRule="auto" w:line="240" w:before="0" w:after="0"/>
                               <w:ind w:hanging="0" w:start="0"/>
                               <w:rPr>
@@ -946,8 +946,8 @@
                   <w:txbxContent>
                     <w:p>
                       <w:pPr>
-                        <w:pStyle w:val="FrameContents"/>
-                        <w:overflowPunct w:val="true"/>
+                        <w:pStyle w:val="FrameContentsuser"/>
+                        <w:overflowPunct w:val="false"/>
                         <w:spacing w:lineRule="auto" w:line="240" w:before="0" w:after="0"/>
                         <w:ind w:hanging="0" w:start="0"/>
                         <w:rPr>
@@ -1016,7 +1016,7 @@
                         <w:txbxContent>
                           <w:p>
                             <w:pPr>
-                              <w:pStyle w:val="FrameContentsuser"/>
+                              <w:pStyle w:val="FrameContents"/>
                               <w:spacing w:before="0" w:after="160"/>
                               <w:ind w:firstLineChars="50"/>
                               <w:rPr>
@@ -1061,7 +1061,7 @@
                   <w:txbxContent>
                     <w:p>
                       <w:pPr>
-                        <w:pStyle w:val="FrameContentsuser"/>
+                        <w:pStyle w:val="FrameContents"/>
                         <w:spacing w:before="0" w:after="160"/>
                         <w:ind w:firstLineChars="50"/>
                         <w:rPr>
@@ -1137,7 +1137,7 @@
                         <w:txbxContent>
                           <w:p>
                             <w:pPr>
-                              <w:pStyle w:val="FrameContentsuser"/>
+                              <w:pStyle w:val="FrameContents"/>
                               <w:spacing w:before="0" w:after="160"/>
                               <w:ind w:firstLineChars="50"/>
                               <w:rPr>
@@ -1182,7 +1182,7 @@
                   <w:txbxContent>
                     <w:p>
                       <w:pPr>
-                        <w:pStyle w:val="FrameContentsuser"/>
+                        <w:pStyle w:val="FrameContents"/>
                         <w:spacing w:before="0" w:after="160"/>
                         <w:ind w:firstLineChars="50"/>
                         <w:rPr>
@@ -1258,7 +1258,7 @@
                         <w:txbxContent>
                           <w:p>
                             <w:pPr>
-                              <w:pStyle w:val="FrameContentsuser"/>
+                              <w:pStyle w:val="FrameContents"/>
                               <w:spacing w:before="0" w:after="160"/>
                               <w:ind w:firstLineChars="50"/>
                               <w:rPr>
@@ -1303,7 +1303,7 @@
                   <w:txbxContent>
                     <w:p>
                       <w:pPr>
-                        <w:pStyle w:val="FrameContentsuser"/>
+                        <w:pStyle w:val="FrameContents"/>
                         <w:spacing w:before="0" w:after="160"/>
                         <w:ind w:firstLineChars="50"/>
                         <w:rPr>
@@ -1377,8 +1377,8 @@
                         <w:txbxContent>
                           <w:p>
                             <w:pPr>
-                              <w:pStyle w:val="FrameContents"/>
-                              <w:overflowPunct w:val="true"/>
+                              <w:pStyle w:val="FrameContentsuser"/>
+                              <w:overflowPunct w:val="false"/>
                               <w:spacing w:lineRule="auto" w:line="240" w:before="0" w:after="0"/>
                               <w:ind w:hanging="0" w:start="0"/>
                               <w:rPr>
@@ -1416,8 +1416,8 @@
                   <w:txbxContent>
                     <w:p>
                       <w:pPr>
-                        <w:pStyle w:val="FrameContents"/>
-                        <w:overflowPunct w:val="true"/>
+                        <w:pStyle w:val="FrameContentsuser"/>
+                        <w:overflowPunct w:val="false"/>
                         <w:spacing w:lineRule="auto" w:line="240" w:before="0" w:after="0"/>
                         <w:ind w:hanging="0" w:start="0"/>
                         <w:rPr>
@@ -1484,8 +1484,8 @@
                         <w:txbxContent>
                           <w:p>
                             <w:pPr>
-                              <w:pStyle w:val="FrameContents"/>
-                              <w:overflowPunct w:val="true"/>
+                              <w:pStyle w:val="FrameContentsuser"/>
+                              <w:overflowPunct w:val="false"/>
                               <w:spacing w:lineRule="auto" w:line="240" w:before="0" w:after="0"/>
                               <w:ind w:hanging="0" w:start="0"/>
                               <w:rPr>
@@ -1523,8 +1523,8 @@
                   <w:txbxContent>
                     <w:p>
                       <w:pPr>
-                        <w:pStyle w:val="FrameContents"/>
-                        <w:overflowPunct w:val="true"/>
+                        <w:pStyle w:val="FrameContentsuser"/>
+                        <w:overflowPunct w:val="false"/>
                         <w:spacing w:lineRule="auto" w:line="240" w:before="0" w:after="0"/>
                         <w:ind w:hanging="0" w:start="0"/>
                         <w:rPr>
@@ -1591,8 +1591,8 @@
                         <w:txbxContent>
                           <w:p>
                             <w:pPr>
-                              <w:pStyle w:val="FrameContents"/>
-                              <w:overflowPunct w:val="true"/>
+                              <w:pStyle w:val="FrameContentsuser"/>
+                              <w:overflowPunct w:val="false"/>
                               <w:bidi w:val="0"/>
                               <w:spacing w:lineRule="auto" w:line="240" w:before="0" w:after="0"/>
                               <w:ind w:hanging="0" w:start="0"/>
@@ -1631,8 +1631,8 @@
                   <w:txbxContent>
                     <w:p>
                       <w:pPr>
-                        <w:pStyle w:val="FrameContents"/>
-                        <w:overflowPunct w:val="true"/>
+                        <w:pStyle w:val="FrameContentsuser"/>
+                        <w:overflowPunct w:val="false"/>
                         <w:bidi w:val="0"/>
                         <w:spacing w:lineRule="auto" w:line="240" w:before="0" w:after="0"/>
                         <w:ind w:hanging="0" w:start="0"/>
@@ -1700,8 +1700,8 @@
                         <w:txbxContent>
                           <w:p>
                             <w:pPr>
-                              <w:pStyle w:val="FrameContents"/>
-                              <w:overflowPunct w:val="true"/>
+                              <w:pStyle w:val="FrameContentsuser"/>
+                              <w:overflowPunct w:val="false"/>
                               <w:spacing w:lineRule="auto" w:line="240" w:before="0" w:after="0"/>
                               <w:ind w:hanging="0" w:start="0"/>
                               <w:rPr>
@@ -1739,8 +1739,8 @@
                   <w:txbxContent>
                     <w:p>
                       <w:pPr>
-                        <w:pStyle w:val="FrameContents"/>
-                        <w:overflowPunct w:val="true"/>
+                        <w:pStyle w:val="FrameContentsuser"/>
+                        <w:overflowPunct w:val="false"/>
                         <w:spacing w:lineRule="auto" w:line="240" w:before="0" w:after="0"/>
                         <w:ind w:hanging="0" w:start="0"/>
                         <w:rPr>
@@ -1807,8 +1807,8 @@
                         <w:txbxContent>
                           <w:p>
                             <w:pPr>
-                              <w:pStyle w:val="FrameContents"/>
-                              <w:overflowPunct w:val="true"/>
+                              <w:pStyle w:val="FrameContentsuser"/>
+                              <w:overflowPunct w:val="false"/>
                               <w:spacing w:lineRule="auto" w:line="240" w:before="0" w:after="0"/>
                               <w:ind w:hanging="0" w:start="0"/>
                               <w:rPr>
@@ -1847,8 +1847,8 @@
                   <w:txbxContent>
                     <w:p>
                       <w:pPr>
-                        <w:pStyle w:val="FrameContents"/>
-                        <w:overflowPunct w:val="true"/>
+                        <w:pStyle w:val="FrameContentsuser"/>
+                        <w:overflowPunct w:val="false"/>
                         <w:spacing w:lineRule="auto" w:line="240" w:before="0" w:after="0"/>
                         <w:ind w:hanging="0" w:start="0"/>
                         <w:rPr>
@@ -1916,8 +1916,8 @@
                         <w:txbxContent>
                           <w:p>
                             <w:pPr>
-                              <w:pStyle w:val="FrameContents"/>
-                              <w:overflowPunct w:val="true"/>
+                              <w:pStyle w:val="FrameContentsuser"/>
+                              <w:overflowPunct w:val="false"/>
                               <w:spacing w:lineRule="auto" w:line="240" w:before="0" w:after="0"/>
                               <w:ind w:hanging="0" w:start="0"/>
                               <w:rPr>
@@ -1956,8 +1956,8 @@
                   <w:txbxContent>
                     <w:p>
                       <w:pPr>
-                        <w:pStyle w:val="FrameContents"/>
-                        <w:overflowPunct w:val="true"/>
+                        <w:pStyle w:val="FrameContentsuser"/>
+                        <w:overflowPunct w:val="false"/>
                         <w:spacing w:lineRule="auto" w:line="240" w:before="0" w:after="0"/>
                         <w:ind w:hanging="0" w:start="0"/>
                         <w:rPr>
@@ -2025,8 +2025,8 @@
                         <w:txbxContent>
                           <w:p>
                             <w:pPr>
-                              <w:pStyle w:val="FrameContents"/>
-                              <w:overflowPunct w:val="true"/>
+                              <w:pStyle w:val="FrameContentsuser"/>
+                              <w:overflowPunct w:val="false"/>
                               <w:spacing w:lineRule="auto" w:line="240" w:before="0" w:after="0"/>
                               <w:ind w:hanging="0" w:start="0"/>
                               <w:rPr>
@@ -2065,8 +2065,8 @@
                   <w:txbxContent>
                     <w:p>
                       <w:pPr>
-                        <w:pStyle w:val="FrameContents"/>
-                        <w:overflowPunct w:val="true"/>
+                        <w:pStyle w:val="FrameContentsuser"/>
+                        <w:overflowPunct w:val="false"/>
                         <w:spacing w:lineRule="auto" w:line="240" w:before="0" w:after="0"/>
                         <w:ind w:hanging="0" w:start="0"/>
                         <w:rPr>
@@ -2134,8 +2134,8 @@
                         <w:txbxContent>
                           <w:p>
                             <w:pPr>
-                              <w:pStyle w:val="FrameContents"/>
-                              <w:overflowPunct w:val="true"/>
+                              <w:pStyle w:val="FrameContentsuser"/>
+                              <w:overflowPunct w:val="false"/>
                               <w:spacing w:lineRule="auto" w:line="240" w:before="0" w:after="0"/>
                               <w:ind w:hanging="0" w:start="0"/>
                               <w:rPr>
@@ -2174,8 +2174,8 @@
                   <w:txbxContent>
                     <w:p>
                       <w:pPr>
-                        <w:pStyle w:val="FrameContents"/>
-                        <w:overflowPunct w:val="true"/>
+                        <w:pStyle w:val="FrameContentsuser"/>
+                        <w:overflowPunct w:val="false"/>
                         <w:spacing w:lineRule="auto" w:line="240" w:before="0" w:after="0"/>
                         <w:ind w:hanging="0" w:start="0"/>
                         <w:rPr>
@@ -2243,8 +2243,8 @@
                         <w:txbxContent>
                           <w:p>
                             <w:pPr>
-                              <w:pStyle w:val="FrameContents"/>
-                              <w:overflowPunct w:val="true"/>
+                              <w:pStyle w:val="FrameContentsuser"/>
+                              <w:overflowPunct w:val="false"/>
                               <w:spacing w:lineRule="auto" w:line="240" w:before="0" w:after="0"/>
                               <w:ind w:hanging="0" w:start="0"/>
                               <w:rPr>
@@ -2278,8 +2278,8 @@
                   <w:txbxContent>
                     <w:p>
                       <w:pPr>
-                        <w:pStyle w:val="FrameContents"/>
-                        <w:overflowPunct w:val="true"/>
+                        <w:pStyle w:val="FrameContentsuser"/>
+                        <w:overflowPunct w:val="false"/>
                         <w:spacing w:lineRule="auto" w:line="240" w:before="0" w:after="0"/>
                         <w:ind w:hanging="0" w:start="0"/>
                         <w:rPr>
@@ -2339,7 +2339,7 @@
         <mc:AlternateContent>
           <mc:Choice Requires="wps">
             <w:drawing>
-              <wp:anchor distT="0" distB="0" distL="0" distR="0" simplePos="0" relativeHeight="18" behindDoc="0" locked="0" layoutInCell="1" allowOverlap="1">
+              <wp:anchor distT="0" distB="0" distL="0" distR="0" simplePos="0" relativeHeight="16" behindDoc="0" locked="0" layoutInCell="1" allowOverlap="1">
                 <wp:simplePos x="0" y="0"/>
                 <wp:positionH relativeFrom="column">
                   <wp:posOffset>3976370</wp:posOffset>
@@ -2380,16 +2380,12 @@
                         <w:txbxContent>
                           <w:p>
                             <w:pPr>
-                              <w:pStyle w:val="FrameContentsuser"/>
+                              <w:pStyle w:val="FrameContents"/>
                               <w:spacing w:before="0" w:after="160"/>
                               <w:ind w:firstLineChars="50"/>
                               <w:rPr>
-                                <w:rFonts w:ascii="Impact" w:hAnsi="Impact" w:cs="Impact"/>
-                                <w:b w:val="false"/>
-                                <w:bCs w:val="false"/>
-                                <w:sz w:val="16"/>
-                                <w:szCs w:val="16"/>
-                                <w:lang w:val="en-US"/>
+                                <w:sz w:val="12"/>
+                                <w:szCs w:val="12"/>
                               </w:rPr>
                             </w:pPr>
                             <w:r>
@@ -2398,8 +2394,8 @@
                                 <w:b w:val="false"/>
                                 <w:bCs w:val="false"/>
                                 <w:color w:val="000000"/>
-                                <w:sz w:val="16"/>
-                                <w:szCs w:val="16"/>
+                                <w:sz w:val="12"/>
+                                <w:szCs w:val="12"/>
                                 <w:lang w:val="en-US"/>
                               </w:rPr>
                               <w:t>${date}</w:t>
@@ -2425,16 +2421,12 @@
                   <w:txbxContent>
                     <w:p>
                       <w:pPr>
-                        <w:pStyle w:val="FrameContentsuser"/>
+                        <w:pStyle w:val="FrameContents"/>
                         <w:spacing w:before="0" w:after="160"/>
                         <w:ind w:firstLineChars="50"/>
                         <w:rPr>
-                          <w:rFonts w:ascii="Impact" w:hAnsi="Impact" w:cs="Impact"/>
-                          <w:b w:val="false"/>
-                          <w:bCs w:val="false"/>
-                          <w:sz w:val="16"/>
-                          <w:szCs w:val="16"/>
-                          <w:lang w:val="en-US"/>
+                          <w:sz w:val="12"/>
+                          <w:szCs w:val="12"/>
                         </w:rPr>
                       </w:pPr>
                       <w:r>
@@ -2443,8 +2435,8 @@
                           <w:b w:val="false"/>
                           <w:bCs w:val="false"/>
                           <w:color w:val="000000"/>
-                          <w:sz w:val="16"/>
-                          <w:szCs w:val="16"/>
+                          <w:sz w:val="12"/>
+                          <w:szCs w:val="12"/>
                           <w:lang w:val="en-US"/>
                         </w:rPr>
                         <w:t>${date}</w:t>
@@ -2460,7 +2452,7 @@
         <mc:AlternateContent>
           <mc:Choice Requires="wps">
             <w:drawing>
-              <wp:anchor distT="0" distB="0" distL="0" distR="0" simplePos="0" relativeHeight="20" behindDoc="0" locked="0" layoutInCell="1" allowOverlap="1">
+              <wp:anchor distT="0" distB="0" distL="0" distR="0" simplePos="0" relativeHeight="18" behindDoc="0" locked="0" layoutInCell="1" allowOverlap="1">
                 <wp:simplePos x="0" y="0"/>
                 <wp:positionH relativeFrom="column">
                   <wp:posOffset>3976370</wp:posOffset>
@@ -2501,16 +2493,12 @@
                         <w:txbxContent>
                           <w:p>
                             <w:pPr>
-                              <w:pStyle w:val="FrameContentsuser"/>
+                              <w:pStyle w:val="FrameContents"/>
                               <w:spacing w:before="0" w:after="160"/>
                               <w:ind w:firstLineChars="50"/>
                               <w:rPr>
-                                <w:rFonts w:ascii="Impact" w:hAnsi="Impact" w:cs="Impact"/>
-                                <w:b w:val="false"/>
-                                <w:bCs w:val="false"/>
-                                <w:sz w:val="16"/>
-                                <w:szCs w:val="16"/>
-                                <w:lang w:val="en-US"/>
+                                <w:sz w:val="12"/>
+                                <w:szCs w:val="12"/>
                               </w:rPr>
                             </w:pPr>
                             <w:r>
@@ -2519,8 +2507,8 @@
                                 <w:b w:val="false"/>
                                 <w:bCs w:val="false"/>
                                 <w:color w:val="000000"/>
-                                <w:sz w:val="16"/>
-                                <w:szCs w:val="16"/>
+                                <w:sz w:val="12"/>
+                                <w:szCs w:val="12"/>
                                 <w:lang w:val="en-US"/>
                               </w:rPr>
                               <w:t>${expiry}</w:t>
@@ -2546,16 +2534,12 @@
                   <w:txbxContent>
                     <w:p>
                       <w:pPr>
-                        <w:pStyle w:val="FrameContentsuser"/>
+                        <w:pStyle w:val="FrameContents"/>
                         <w:spacing w:before="0" w:after="160"/>
                         <w:ind w:firstLineChars="50"/>
                         <w:rPr>
-                          <w:rFonts w:ascii="Impact" w:hAnsi="Impact" w:cs="Impact"/>
-                          <w:b w:val="false"/>
-                          <w:bCs w:val="false"/>
-                          <w:sz w:val="16"/>
-                          <w:szCs w:val="16"/>
-                          <w:lang w:val="en-US"/>
+                          <w:sz w:val="12"/>
+                          <w:szCs w:val="12"/>
                         </w:rPr>
                       </w:pPr>
                       <w:r>
@@ -2564,8 +2548,8 @@
                           <w:b w:val="false"/>
                           <w:bCs w:val="false"/>
                           <w:color w:val="000000"/>
-                          <w:sz w:val="16"/>
-                          <w:szCs w:val="16"/>
+                          <w:sz w:val="12"/>
+                          <w:szCs w:val="12"/>
                           <w:lang w:val="en-US"/>
                         </w:rPr>
                         <w:t>${expiry}</w:t>
@@ -3218,7 +3202,7 @@
                         <w:txbxContent>
                           <w:p>
                             <w:pPr>
-                              <w:pStyle w:val="FrameContentsuser"/>
+                              <w:pStyle w:val="FrameContents"/>
                               <w:spacing w:before="0" w:after="160"/>
                               <w:rPr>
                                 <w:rFonts w:ascii="Impact" w:hAnsi="Impact"/>
@@ -3252,7 +3236,7 @@
                   <w:txbxContent>
                     <w:p>
                       <w:pPr>
-                        <w:pStyle w:val="FrameContentsuser"/>
+                        <w:pStyle w:val="FrameContents"/>
                         <w:spacing w:before="0" w:after="160"/>
                         <w:rPr>
                           <w:rFonts w:ascii="Impact" w:hAnsi="Impact"/>
@@ -3973,15 +3957,15 @@
       <w:szCs w:val="24"/>
     </w:rPr>
   </w:style>
-  <w:style w:type="paragraph" w:styleId="FrameContentsuser">
-    <w:name w:val="Frame Contents (user)"/>
+  <w:style w:type="paragraph" w:styleId="FrameContents">
+    <w:name w:val="Frame Contents"/>
     <w:basedOn w:val="Normal"/>
     <w:qFormat/>
     <w:pPr/>
     <w:rPr/>
   </w:style>
-  <w:style w:type="paragraph" w:styleId="FrameContents">
-    <w:name w:val="Frame Contents"/>
+  <w:style w:type="paragraph" w:styleId="FrameContentsuser">
+    <w:name w:val="Frame Contents (user)"/>
     <w:basedOn w:val="Normal"/>
     <w:qFormat/>
     <w:pPr/>

</xml_diff>